<commit_message>
Fix code review issues: accessibility, memory leaks, resume download, and meta updates
- Fix resume download path for GitHub Pages (use PUBLIC_URL)
- Update resume file with latest version
- Fix memory leak in ShootingStars (cleanup timeouts on unmount)
- Remove unnecessary scroll listener in ScrollIndicator
- Add Escape key handlers for mobile menu and contact drawer
- Add aria-labels to icon-only buttons and social links
- Add role/aria-modal to contact drawer overlay
- Update meta description to match current experience (3+ years)
- Self-close link tags in index.html
- Dynamic copyright year in Footer
</commit_message>
<xml_diff>
--- a/public/resume.docx
+++ b/public/resume.docx
@@ -11,16 +11,16 @@
         <w:ind w:left="-720" w:right="-360" w:firstLine="0"/>
         <w:jc w:val="left"/>
         <w:rPr>
-          <w:sz w:val="56"/>
-          <w:szCs w:val="56"/>
+          <w:sz w:val="52"/>
+          <w:szCs w:val="52"/>
         </w:rPr>
       </w:pPr>
       <w:r>
         <w:rPr>
           <w:b w:val="1"/>
           <w:bCs w:val="1"/>
-          <w:sz w:val="56"/>
-          <w:szCs w:val="56"/>
+          <w:sz w:val="52"/>
+          <w:szCs w:val="52"/>
           <w:rtl w:val="0"/>
         </w:rPr>
         <w:t xml:space="preserve">SHREYASH WADMALWAR</w:t>
@@ -33,7 +33,7 @@
     </w:p>
     <w:p>
       <w:pPr>
-        <w:spacing w:line="240" w:lineRule="auto"/>
+        <w:spacing w:line="276" w:lineRule="auto"/>
         <w:ind w:left="-720" w:firstLine="0"/>
         <w:jc w:val="left"/>
         <w:rPr>
@@ -59,7 +59,7 @@
     </w:p>
     <w:p>
       <w:pPr>
-        <w:spacing w:line="240" w:lineRule="auto"/>
+        <w:spacing w:line="276" w:lineRule="auto"/>
         <w:ind w:left="-720" w:firstLine="0"/>
         <w:jc w:val="right"/>
         <w:rPr>
@@ -75,15 +75,10 @@
         </w:rPr>
         <w:t xml:space="preserve">sdwadmalwar@gmail.com</w:t>
       </w:r>
-      <w:r>
-        <w:rPr>
-          <w:rtl w:val="0"/>
-        </w:rPr>
-      </w:r>
-    </w:p>
-    <w:p>
-      <w:pPr>
-        <w:spacing w:line="240" w:lineRule="auto"/>
+    </w:p>
+    <w:p>
+      <w:pPr>
+        <w:spacing w:line="276" w:lineRule="auto"/>
         <w:ind w:left="-720" w:firstLine="0"/>
         <w:jc w:val="right"/>
         <w:rPr>
@@ -102,7 +97,7 @@
     </w:p>
     <w:p>
       <w:pPr>
-        <w:spacing w:line="240" w:lineRule="auto"/>
+        <w:spacing w:line="276" w:lineRule="auto"/>
         <w:ind w:left="-720" w:firstLine="0"/>
         <w:jc w:val="right"/>
         <w:rPr>
@@ -113,76 +108,24 @@
           <w:pgSz w:h="15840" w:w="12240" w:orient="portrait"/>
           <w:pgMar w:bottom="720" w:top="720" w:left="1080" w:right="360" w:header="720" w:footer="720"/>
           <w:pgNumType w:start="1"/>
-          <w:cols w:equalWidth="0" w:num="1">
-            <w:col w:space="0" w:w="10800"/>
-          </w:cols>
         </w:sectPr>
       </w:pPr>
-      <w:r>
-        <w:rPr>
-          <w:sz w:val="24"/>
-          <w:szCs w:val="24"/>
-          <w:rtl w:val="0"/>
-        </w:rPr>
-        <w:t xml:space="preserve">https://www.linkedin.com/in/shreyash-wadmalwar</w:t>
-      </w:r>
-    </w:p>
-    <w:p>
-      <w:pPr>
-        <w:ind w:left="-720" w:firstLine="0"/>
-        <w:rPr/>
-      </w:pPr>
-      <w:r>
-        <w:rPr>
-          <w:rtl w:val="0"/>
-        </w:rPr>
-      </w:r>
-    </w:p>
-    <w:p>
-      <w:pPr>
-        <w:pBdr>
-          <w:bottom w:color="000000" w:space="1" w:sz="12" w:val="single"/>
-        </w:pBdr>
-        <w:spacing w:after="120" w:before="240" w:lineRule="auto"/>
-        <w:ind w:left="-720" w:firstLine="0"/>
-        <w:rPr>
-          <w:sz w:val="40"/>
-          <w:szCs w:val="40"/>
-        </w:rPr>
-      </w:pPr>
-      <w:r>
-        <w:rPr>
-          <w:b w:val="1"/>
-          <w:bCs w:val="1"/>
-          <w:color w:val="000000"/>
-          <w:sz w:val="40"/>
-          <w:szCs w:val="40"/>
-          <w:rtl w:val="0"/>
-        </w:rPr>
-        <w:t xml:space="preserve">PROFILE</w:t>
-      </w:r>
-      <w:r>
-        <w:rPr>
-          <w:rtl w:val="0"/>
-        </w:rPr>
-      </w:r>
-    </w:p>
-    <w:p>
-      <w:pPr>
-        <w:spacing w:after="120" w:lineRule="auto"/>
-        <w:ind w:left="-720" w:firstLine="0"/>
-        <w:rPr>
-          <w:sz w:val="24"/>
-          <w:szCs w:val="24"/>
-        </w:rPr>
-      </w:pPr>
-      <w:r>
-        <w:rPr>
-          <w:sz w:val="24"/>
-          <w:szCs w:val="24"/>
-          <w:rtl w:val="0"/>
-        </w:rPr>
-        <w:t xml:space="preserve">Full Stack Developer with 3+ years of experience shipping production SaaS features at scale. Specialized in React, Next.js, Node.js, and PHP with expertise in building complex automation platforms and high-performance applications serving 140,000+ users globally.</w:t>
+      <w:hyperlink r:id="rId6">
+        <w:r>
+          <w:rPr>
+            <w:color w:val="1155cc"/>
+            <w:sz w:val="24"/>
+            <w:szCs w:val="24"/>
+            <w:u w:val="single"/>
+            <w:rtl w:val="0"/>
+          </w:rPr>
+          <w:t xml:space="preserve">https://www.linkedin.com/in/shreyash-wadmalwar</w:t>
+        </w:r>
+      </w:hyperlink>
+      <w:r>
+        <w:rPr>
+          <w:rtl w:val="0"/>
+        </w:rPr>
       </w:r>
     </w:p>
     <w:p>
@@ -247,32 +190,21 @@
           <w:between w:space="0" w:sz="0" w:val="nil"/>
         </w:pBdr>
         <w:shd w:fill="auto" w:val="clear"/>
-        <w:spacing w:after="0" w:before="0" w:line="276" w:lineRule="auto"/>
+        <w:spacing w:after="0" w:before="0" w:line="360" w:lineRule="auto"/>
         <w:ind w:left="-360" w:right="0" w:hanging="360"/>
         <w:jc w:val="left"/>
         <w:rPr>
           <w:sz w:val="24"/>
           <w:szCs w:val="24"/>
-          <w:u w:val="none"/>
-        </w:rPr>
-      </w:pPr>
-      <w:r>
-        <w:rPr>
-          <w:b w:val="1"/>
-          <w:bCs w:val="1"/>
-          <w:sz w:val="24"/>
-          <w:szCs w:val="24"/>
-          <w:rtl w:val="0"/>
-        </w:rPr>
-        <w:t xml:space="preserve">Built unified authentication system</w:t>
-      </w:r>
-      <w:r>
-        <w:rPr>
-          <w:sz w:val="24"/>
-          <w:szCs w:val="24"/>
-          <w:rtl w:val="0"/>
-        </w:rPr>
-        <w:t xml:space="preserve"> connecting OttoKit and all sub-products, eliminating login fragmentation and improving user retention.</w:t>
+        </w:rPr>
+      </w:pPr>
+      <w:r>
+        <w:rPr>
+          <w:sz w:val="24"/>
+          <w:szCs w:val="24"/>
+          <w:rtl w:val="0"/>
+        </w:rPr>
+        <w:t xml:space="preserve">Built and shipped 2 major full-stack features (OttoKit Tables and Forms) end-to-end, from database design to production deployment.</w:t>
       </w:r>
     </w:p>
     <w:p>
@@ -293,32 +225,21 @@
           <w:between w:space="0" w:sz="0" w:val="nil"/>
         </w:pBdr>
         <w:shd w:fill="auto" w:val="clear"/>
-        <w:spacing w:after="0" w:before="0" w:line="276" w:lineRule="auto"/>
+        <w:spacing w:after="0" w:before="0" w:line="360" w:lineRule="auto"/>
         <w:ind w:left="-360" w:right="0" w:hanging="360"/>
         <w:jc w:val="left"/>
         <w:rPr>
           <w:sz w:val="24"/>
           <w:szCs w:val="24"/>
-          <w:u w:val="none"/>
-        </w:rPr>
-      </w:pPr>
-      <w:r>
-        <w:rPr>
-          <w:b w:val="1"/>
-          <w:bCs w:val="1"/>
-          <w:sz w:val="24"/>
-          <w:szCs w:val="24"/>
-          <w:rtl w:val="0"/>
-        </w:rPr>
-        <w:t xml:space="preserve">Architected mission-critical product features </w:t>
-      </w:r>
-      <w:r>
-        <w:rPr>
-          <w:sz w:val="24"/>
-          <w:szCs w:val="24"/>
-          <w:rtl w:val="0"/>
-        </w:rPr>
-        <w:t xml:space="preserve">like  OttoKit Tables (data management replacing Google Sheets), OttoKit Forms (AI-powered form builder), SureDash redesign (WordPress monolith to Next.js, 25% performance gain).</w:t>
+        </w:rPr>
+      </w:pPr>
+      <w:r>
+        <w:rPr>
+          <w:sz w:val="24"/>
+          <w:szCs w:val="24"/>
+          <w:rtl w:val="0"/>
+        </w:rPr>
+        <w:t xml:space="preserve">Built a customer-facing MCP server platform supporting 1,500+ AI-callable tools, compatible with Claude Desktop, Cursor IDE, and ChatGPT.</w:t>
       </w:r>
     </w:p>
     <w:p>
@@ -339,32 +260,21 @@
           <w:between w:space="0" w:sz="0" w:val="nil"/>
         </w:pBdr>
         <w:shd w:fill="auto" w:val="clear"/>
-        <w:spacing w:after="0" w:before="0" w:line="276" w:lineRule="auto"/>
+        <w:spacing w:after="0" w:before="0" w:line="360" w:lineRule="auto"/>
         <w:ind w:left="-360" w:right="0" w:hanging="360"/>
         <w:jc w:val="left"/>
         <w:rPr>
           <w:sz w:val="24"/>
           <w:szCs w:val="24"/>
-          <w:u w:val="none"/>
-        </w:rPr>
-      </w:pPr>
-      <w:r>
-        <w:rPr>
-          <w:b w:val="1"/>
-          <w:bCs w:val="1"/>
-          <w:sz w:val="24"/>
-          <w:szCs w:val="24"/>
-          <w:rtl w:val="0"/>
-        </w:rPr>
-        <w:t xml:space="preserve">Optimized API performance by 25%</w:t>
-      </w:r>
-      <w:r>
-        <w:rPr>
-          <w:sz w:val="24"/>
-          <w:szCs w:val="24"/>
-          <w:rtl w:val="0"/>
-        </w:rPr>
-        <w:t xml:space="preserve"> through REST refactoring, Redis caching, and async job queue optimization handling 700+ integrations at 99.9% uptime.</w:t>
+        </w:rPr>
+      </w:pPr>
+      <w:r>
+        <w:rPr>
+          <w:sz w:val="24"/>
+          <w:szCs w:val="24"/>
+          <w:rtl w:val="0"/>
+        </w:rPr>
+        <w:t xml:space="preserve">Improved API performance by 25% using Redis caching, REST refactoring, and async job queues across 700+ integrations.</w:t>
       </w:r>
     </w:p>
     <w:p>
@@ -385,32 +295,21 @@
           <w:between w:space="0" w:sz="0" w:val="nil"/>
         </w:pBdr>
         <w:shd w:fill="auto" w:val="clear"/>
-        <w:spacing w:after="0" w:before="0" w:line="276" w:lineRule="auto"/>
+        <w:spacing w:after="0" w:before="0" w:line="360" w:lineRule="auto"/>
         <w:ind w:left="-360" w:right="0" w:hanging="360"/>
         <w:jc w:val="left"/>
         <w:rPr>
           <w:sz w:val="24"/>
           <w:szCs w:val="24"/>
-          <w:u w:val="none"/>
-        </w:rPr>
-      </w:pPr>
-      <w:r>
-        <w:rPr>
-          <w:b w:val="1"/>
-          <w:bCs w:val="1"/>
-          <w:sz w:val="24"/>
-          <w:szCs w:val="24"/>
-          <w:rtl w:val="0"/>
-        </w:rPr>
-        <w:t xml:space="preserve">Enabled data-driven decisions</w:t>
-      </w:r>
-      <w:r>
-        <w:rPr>
-          <w:sz w:val="24"/>
-          <w:szCs w:val="24"/>
-          <w:rtl w:val="0"/>
-        </w:rPr>
-        <w:t xml:space="preserve"> through ClickHouse analytics pipelines, interactive onboarding flows, and dashboards tracking key metrics for product roadmap prioritization.</w:t>
+        </w:rPr>
+      </w:pPr>
+      <w:r>
+        <w:rPr>
+          <w:sz w:val="24"/>
+          <w:szCs w:val="24"/>
+          <w:rtl w:val="0"/>
+        </w:rPr>
+        <w:t xml:space="preserve">Built ClickHouse analytics pipelines and onboarding flows that gave the product team visibility into user behavior and key metrics.</w:t>
       </w:r>
     </w:p>
     <w:p>
@@ -431,32 +330,21 @@
           <w:between w:space="0" w:sz="0" w:val="nil"/>
         </w:pBdr>
         <w:shd w:fill="auto" w:val="clear"/>
-        <w:spacing w:after="0" w:before="0" w:line="276" w:lineRule="auto"/>
+        <w:spacing w:after="0" w:before="0" w:line="360" w:lineRule="auto"/>
         <w:ind w:left="-360" w:right="0" w:hanging="360"/>
         <w:jc w:val="left"/>
         <w:rPr>
           <w:sz w:val="24"/>
           <w:szCs w:val="24"/>
-          <w:u w:val="none"/>
-        </w:rPr>
-      </w:pPr>
-      <w:r>
-        <w:rPr>
-          <w:b w:val="1"/>
-          <w:bCs w:val="1"/>
-          <w:sz w:val="24"/>
-          <w:szCs w:val="24"/>
-          <w:rtl w:val="0"/>
-        </w:rPr>
-        <w:t xml:space="preserve">Collaborated cross-functionally</w:t>
-      </w:r>
-      <w:r>
-        <w:rPr>
-          <w:sz w:val="24"/>
-          <w:szCs w:val="24"/>
-          <w:rtl w:val="0"/>
-        </w:rPr>
-        <w:t xml:space="preserve"> with product, marketing, and QA teams to ship features on schedule.</w:t>
+        </w:rPr>
+      </w:pPr>
+      <w:r>
+        <w:rPr>
+          <w:sz w:val="24"/>
+          <w:szCs w:val="24"/>
+          <w:rtl w:val="0"/>
+        </w:rPr>
+        <w:t xml:space="preserve">Led the SureDash frontend migration from WordPress to Next.js, cutting page load times significantly.</w:t>
       </w:r>
     </w:p>
     <w:p>
@@ -518,7 +406,7 @@
     </w:p>
     <w:p>
       <w:pPr>
-        <w:spacing w:after="60" w:lineRule="auto"/>
+        <w:spacing w:after="60" w:line="360" w:lineRule="auto"/>
         <w:ind w:left="-720" w:firstLine="0"/>
         <w:rPr>
           <w:sz w:val="24"/>
@@ -546,7 +434,7 @@
     </w:p>
     <w:p>
       <w:pPr>
-        <w:spacing w:after="60" w:lineRule="auto"/>
+        <w:spacing w:after="60" w:line="360" w:lineRule="auto"/>
         <w:ind w:left="-720" w:firstLine="0"/>
         <w:rPr>
           <w:sz w:val="24"/>
@@ -574,7 +462,7 @@
     </w:p>
     <w:p>
       <w:pPr>
-        <w:spacing w:after="60" w:lineRule="auto"/>
+        <w:spacing w:after="60" w:line="360" w:lineRule="auto"/>
         <w:ind w:left="-720" w:firstLine="0"/>
         <w:rPr>
           <w:sz w:val="24"/>
@@ -602,7 +490,7 @@
     </w:p>
     <w:p>
       <w:pPr>
-        <w:spacing w:after="60" w:lineRule="auto"/>
+        <w:spacing w:after="60" w:line="360" w:lineRule="auto"/>
         <w:ind w:left="-720" w:firstLine="0"/>
         <w:rPr>
           <w:sz w:val="24"/>
@@ -625,12 +513,12 @@
           <w:szCs w:val="24"/>
           <w:rtl w:val="0"/>
         </w:rPr>
-        <w:t xml:space="preserve"> MySQL, PostgreSQL, Redis, ClickHouse</w:t>
-      </w:r>
-    </w:p>
-    <w:p>
-      <w:pPr>
-        <w:spacing w:after="60" w:lineRule="auto"/>
+        <w:t xml:space="preserve"> MySQL, PostgreSQL, Redis, ClickHouse, AWS</w:t>
+      </w:r>
+    </w:p>
+    <w:p>
+      <w:pPr>
+        <w:spacing w:after="60" w:line="360" w:lineRule="auto"/>
         <w:ind w:left="-720" w:firstLine="0"/>
         <w:rPr>
           <w:sz w:val="24"/>
@@ -653,12 +541,12 @@
           <w:szCs w:val="24"/>
           <w:rtl w:val="0"/>
         </w:rPr>
-        <w:t xml:space="preserve">Git, GitHub, npm/Yarn, Webpack, VS Code</w:t>
-      </w:r>
-    </w:p>
-    <w:p>
-      <w:pPr>
-        <w:spacing w:after="60" w:lineRule="auto"/>
+        <w:t xml:space="preserve">Git, GitHub, npm/Yarn, Postman, AWS Lambda</w:t>
+      </w:r>
+    </w:p>
+    <w:p>
+      <w:pPr>
+        <w:spacing w:after="60" w:line="360" w:lineRule="auto"/>
         <w:ind w:left="-720" w:firstLine="0"/>
         <w:rPr>
           <w:sz w:val="24"/>
@@ -681,22 +569,35 @@
           <w:szCs w:val="24"/>
           <w:rtl w:val="0"/>
         </w:rPr>
-        <w:t xml:space="preserve">SaaS architecture, API design, WordPress integration, performance optimization, event-driven systems</w:t>
-      </w:r>
-    </w:p>
-    <w:p>
-      <w:pPr>
-        <w:spacing w:after="60" w:lineRule="auto"/>
-        <w:ind w:left="-720" w:firstLine="0"/>
-        <w:rPr>
-          <w:sz w:val="24"/>
-          <w:szCs w:val="24"/>
-        </w:rPr>
-      </w:pPr>
-      <w:r>
-        <w:rPr>
-          <w:rtl w:val="0"/>
-        </w:rPr>
+        <w:t xml:space="preserve">SaaS architecture, API design, performance optimization, event-driven systems, MCP server development, LLM integration, AI agent tooling</w:t>
+      </w:r>
+    </w:p>
+    <w:p>
+      <w:pPr>
+        <w:spacing w:after="60" w:line="360" w:lineRule="auto"/>
+        <w:ind w:left="-720" w:firstLine="0"/>
+        <w:rPr>
+          <w:sz w:val="24"/>
+          <w:szCs w:val="24"/>
+        </w:rPr>
+      </w:pPr>
+      <w:r>
+        <w:rPr>
+          <w:b w:val="1"/>
+          <w:bCs w:val="1"/>
+          <w:sz w:val="24"/>
+          <w:szCs w:val="24"/>
+          <w:rtl w:val="0"/>
+        </w:rPr>
+        <w:t xml:space="preserve">AI &amp; LLM:</w:t>
+      </w:r>
+      <w:r>
+        <w:rPr>
+          <w:sz w:val="24"/>
+          <w:szCs w:val="24"/>
+          <w:rtl w:val="0"/>
+        </w:rPr>
+        <w:t xml:space="preserve"> OpenAI API, Anthropic Claude API, Google Gemini API, MCP, LLM provider integration</w:t>
       </w:r>
     </w:p>
     <w:p>
@@ -758,86 +659,68 @@
         <w:spacing w:after="160" w:lineRule="auto"/>
         <w:ind w:left="-720" w:firstLine="0"/>
         <w:rPr>
-          <w:sz w:val="24"/>
-          <w:szCs w:val="24"/>
-        </w:rPr>
-      </w:pPr>
-      <w:r>
-        <w:rPr>
           <w:i w:val="1"/>
           <w:iCs w:val="1"/>
           <w:sz w:val="24"/>
           <w:szCs w:val="24"/>
-          <w:rtl w:val="0"/>
-        </w:rPr>
-        <w:t xml:space="preserve">April 2023 – Present | Pune, India</w:t>
-      </w:r>
-      <w:r>
-        <w:rPr>
-          <w:rtl w:val="0"/>
-        </w:rPr>
+        </w:rPr>
+      </w:pPr>
+      <w:r>
+        <w:rPr>
+          <w:i w:val="1"/>
+          <w:iCs w:val="1"/>
+          <w:sz w:val="24"/>
+          <w:szCs w:val="24"/>
+          <w:rtl w:val="0"/>
+        </w:rPr>
+        <w:t xml:space="preserve">April 2023 – Present | Remote, India</w:t>
       </w:r>
     </w:p>
     <w:p>
       <w:pPr>
         <w:spacing w:after="0" w:before="60" w:lineRule="auto"/>
         <w:ind w:left="-720" w:firstLine="0"/>
+        <w:rPr>
+          <w:i w:val="1"/>
+          <w:iCs w:val="1"/>
+          <w:sz w:val="24"/>
+          <w:szCs w:val="24"/>
+          <w:u w:val="single"/>
+        </w:rPr>
+      </w:pPr>
+      <w:r>
         <w:rPr>
           <w:b w:val="1"/>
           <w:bCs w:val="1"/>
           <w:sz w:val="26"/>
           <w:szCs w:val="26"/>
-        </w:rPr>
-      </w:pPr>
-      <w:r>
-        <w:rPr>
-          <w:b w:val="1"/>
-          <w:bCs w:val="1"/>
-          <w:sz w:val="26"/>
-          <w:szCs w:val="26"/>
+          <w:u w:val="single"/>
           <w:rtl w:val="0"/>
         </w:rPr>
         <w:t xml:space="preserve">OttoKit - Automation Platform</w:t>
       </w:r>
+      <w:r>
+        <w:rPr>
+          <w:rtl w:val="0"/>
+        </w:rPr>
+      </w:r>
     </w:p>
     <w:p>
       <w:pPr>
         <w:spacing w:after="0" w:before="60" w:lineRule="auto"/>
         <w:ind w:left="-720" w:firstLine="0"/>
         <w:rPr>
-          <w:i w:val="1"/>
-          <w:iCs w:val="1"/>
-          <w:sz w:val="24"/>
-          <w:szCs w:val="24"/>
-        </w:rPr>
-      </w:pPr>
-      <w:r>
-        <w:rPr>
-          <w:i w:val="1"/>
-          <w:iCs w:val="1"/>
-          <w:sz w:val="24"/>
-          <w:szCs w:val="24"/>
-          <w:rtl w:val="0"/>
-        </w:rPr>
-        <w:t xml:space="preserve">Frontend (Next.js/React) &amp; Backend (PHP) </w:t>
-      </w:r>
-    </w:p>
-    <w:p>
-      <w:pPr>
-        <w:spacing w:after="60" w:lineRule="auto"/>
-        <w:ind w:left="-720" w:firstLine="0"/>
-        <w:rPr>
-          <w:sz w:val="24"/>
-          <w:szCs w:val="24"/>
-        </w:rPr>
-      </w:pPr>
-      <w:r>
-        <w:rPr>
-          <w:sz w:val="24"/>
-          <w:szCs w:val="24"/>
-          <w:rtl w:val="0"/>
-        </w:rPr>
-        <w:t xml:space="preserve">No-code automation platform enabling users to create workflows, build forms, manage data tables, and integrate with 700+ external services.</w:t>
+          <w:sz w:val="24"/>
+          <w:szCs w:val="24"/>
+        </w:rPr>
+      </w:pPr>
+      <w:r>
+        <w:rPr>
+          <w:sz w:val="24"/>
+          <w:szCs w:val="24"/>
+          <w:rtl w:val="0"/>
+        </w:rPr>
+        <w:t xml:space="preserve">No-code automation platform enabling users to create workflows, build forms, manage data tables, and integrate with 1,500+ external services.</w:t>
       </w:r>
     </w:p>
     <w:p>
@@ -872,7 +755,7 @@
           <w:szCs w:val="24"/>
           <w:rtl w:val="0"/>
         </w:rPr>
-        <w:t xml:space="preserve">Engineered AI-powered OttoKit Forms with drag-and-drop builder and public form deployment.</w:t>
+        <w:t xml:space="preserve">Built a customer-facing MCP server platform exposing 1,500+ integration actions as AI-callable tools, compatible with Claude Desktop, Cursor IDE, and ChatGPT; built multi-LLM support for 16+ models across OpenAI, Anthropic, and Google.</w:t>
       </w:r>
     </w:p>
     <w:p>
@@ -907,7 +790,7 @@
           <w:szCs w:val="24"/>
           <w:rtl w:val="0"/>
         </w:rPr>
-        <w:t xml:space="preserve">Built OttoKit Tables (Zapier-style data management) with CRUD operations, field customization, and plan-based tiering.</w:t>
+        <w:t xml:space="preserve">Built OttoKit Forms from scratch with drag-and-drop builder, AI form generation, secure public deployment, and automatic data sync to OttoKit Tables.</w:t>
       </w:r>
     </w:p>
     <w:p>
@@ -942,7 +825,7 @@
           <w:szCs w:val="24"/>
           <w:rtl w:val="0"/>
         </w:rPr>
-        <w:t xml:space="preserve">Architected Global Variables system with encryption for secure secret management across workflows.</w:t>
+        <w:t xml:space="preserve">Built OttoKit Tables from scratch with CSV import/export, fulltext search, filters, sorting, linked records, and plan-based row limits using background job processing.</w:t>
       </w:r>
     </w:p>
     <w:p>
@@ -977,7 +860,7 @@
           <w:szCs w:val="24"/>
           <w:rtl w:val="0"/>
         </w:rPr>
-        <w:t xml:space="preserve">Optimized API performance by 25% through REST refactoring, Redis caching, and async job queue optimization.</w:t>
+        <w:t xml:space="preserve">Built a Global Variables system with encryption for managing secrets securely across workflow executions.</w:t>
       </w:r>
     </w:p>
     <w:p>
@@ -1012,7 +895,7 @@
           <w:szCs w:val="24"/>
           <w:rtl w:val="0"/>
         </w:rPr>
-        <w:t xml:space="preserve">Designed event-driven architecture with 50+ domain events enabling real-time automation across 170+ integrations via WebSocket.</w:t>
+        <w:t xml:space="preserve">Improved API performance by 25% using REST refactoring, Redis caching, and async job queues.</w:t>
       </w:r>
     </w:p>
     <w:p>
@@ -1047,87 +930,7 @@
           <w:szCs w:val="24"/>
           <w:rtl w:val="0"/>
         </w:rPr>
-        <w:t xml:space="preserve">Built WordPress plugin integrations for Store Engine, LatePoint, and SureDash enabling e-commerce and booking automation.</w:t>
-      </w:r>
-    </w:p>
-    <w:p>
-      <w:pPr>
-        <w:spacing w:after="120" w:lineRule="auto"/>
-        <w:ind w:left="-720" w:firstLine="0"/>
-        <w:rPr>
-          <w:sz w:val="24"/>
-          <w:szCs w:val="24"/>
-        </w:rPr>
-      </w:pPr>
-      <w:r>
-        <w:rPr>
-          <w:rtl w:val="0"/>
-        </w:rPr>
-      </w:r>
-    </w:p>
-    <w:p>
-      <w:pPr>
-        <w:spacing w:after="0" w:before="120" w:lineRule="auto"/>
-        <w:ind w:left="-720" w:firstLine="0"/>
-        <w:rPr>
-          <w:sz w:val="26"/>
-          <w:szCs w:val="26"/>
-        </w:rPr>
-      </w:pPr>
-      <w:r>
-        <w:rPr>
-          <w:b w:val="1"/>
-          <w:bCs w:val="1"/>
-          <w:sz w:val="26"/>
-          <w:szCs w:val="26"/>
-          <w:rtl w:val="0"/>
-        </w:rPr>
-        <w:t xml:space="preserve">SureDash - Community Dashboard</w:t>
-      </w:r>
-      <w:r>
-        <w:rPr>
-          <w:rtl w:val="0"/>
-        </w:rPr>
-      </w:r>
-    </w:p>
-    <w:p>
-      <w:pPr>
-        <w:spacing w:after="60" w:lineRule="auto"/>
-        <w:ind w:left="-720" w:firstLine="0"/>
-        <w:rPr>
-          <w:i w:val="1"/>
-          <w:iCs w:val="1"/>
-          <w:sz w:val="24"/>
-          <w:szCs w:val="24"/>
-        </w:rPr>
-      </w:pPr>
-      <w:r>
-        <w:rPr>
-          <w:i w:val="1"/>
-          <w:iCs w:val="1"/>
-          <w:sz w:val="24"/>
-          <w:szCs w:val="24"/>
-          <w:rtl w:val="0"/>
-        </w:rPr>
-        <w:t xml:space="preserve">Frontend (React) &amp; Backend (PHP) </w:t>
-      </w:r>
-    </w:p>
-    <w:p>
-      <w:pPr>
-        <w:spacing w:after="60" w:lineRule="auto"/>
-        <w:ind w:left="-720" w:firstLine="0"/>
-        <w:rPr>
-          <w:sz w:val="24"/>
-          <w:szCs w:val="24"/>
-        </w:rPr>
-      </w:pPr>
-      <w:r>
-        <w:rPr>
-          <w:sz w:val="24"/>
-          <w:szCs w:val="24"/>
-          <w:rtl w:val="0"/>
-        </w:rPr>
-        <w:t xml:space="preserve">Community engagement platform for user discussions and content management.</w:t>
+        <w:t xml:space="preserve">Designed an event-driven system with 50+ domain events for real-time automation across 170+ integrations via WebSocket.</w:t>
       </w:r>
     </w:p>
     <w:p>
@@ -1162,7 +965,7 @@
           <w:szCs w:val="24"/>
           <w:rtl w:val="0"/>
         </w:rPr>
-        <w:t xml:space="preserve">Led React migration from WordPress monolith to Next.js, improving performance by 25%.</w:t>
+        <w:t xml:space="preserve">Fixed security vulnerabilities including SSRF, XSS, open redirects, and CSS injection; also improved accessibility to WCAG 2.2 Level AA.</w:t>
       </w:r>
     </w:p>
     <w:p>
@@ -1197,7 +1000,69 @@
           <w:szCs w:val="24"/>
           <w:rtl w:val="0"/>
         </w:rPr>
-        <w:t xml:space="preserve">Developed reusable React components with optimized PHP REST APIs replacing legacy AJAX.</w:t>
+        <w:t xml:space="preserve">Built WordPress plugin integrations for Store Engine, LatePoint, and SureDash to support e-commerce and booking automation.</w:t>
+      </w:r>
+    </w:p>
+    <w:p>
+      <w:pPr>
+        <w:spacing w:after="120" w:lineRule="auto"/>
+        <w:ind w:left="-720" w:firstLine="0"/>
+        <w:rPr>
+          <w:sz w:val="24"/>
+          <w:szCs w:val="24"/>
+        </w:rPr>
+      </w:pPr>
+      <w:r>
+        <w:rPr>
+          <w:rtl w:val="0"/>
+        </w:rPr>
+      </w:r>
+    </w:p>
+    <w:p>
+      <w:pPr>
+        <w:spacing w:after="0" w:before="120" w:lineRule="auto"/>
+        <w:ind w:left="-720" w:firstLine="0"/>
+        <w:rPr>
+          <w:i w:val="1"/>
+          <w:iCs w:val="1"/>
+          <w:sz w:val="24"/>
+          <w:szCs w:val="24"/>
+          <w:u w:val="single"/>
+        </w:rPr>
+      </w:pPr>
+      <w:r>
+        <w:rPr>
+          <w:b w:val="1"/>
+          <w:bCs w:val="1"/>
+          <w:sz w:val="26"/>
+          <w:szCs w:val="26"/>
+          <w:u w:val="single"/>
+          <w:rtl w:val="0"/>
+        </w:rPr>
+        <w:t xml:space="preserve">SureDash - Community Dashboard</w:t>
+      </w:r>
+      <w:r>
+        <w:rPr>
+          <w:rtl w:val="0"/>
+        </w:rPr>
+      </w:r>
+    </w:p>
+    <w:p>
+      <w:pPr>
+        <w:spacing w:after="60" w:lineRule="auto"/>
+        <w:ind w:left="-720" w:firstLine="0"/>
+        <w:rPr>
+          <w:sz w:val="24"/>
+          <w:szCs w:val="24"/>
+        </w:rPr>
+      </w:pPr>
+      <w:r>
+        <w:rPr>
+          <w:sz w:val="24"/>
+          <w:szCs w:val="24"/>
+          <w:rtl w:val="0"/>
+        </w:rPr>
+        <w:t xml:space="preserve">Community engagement platform for user discussions and content management.</w:t>
       </w:r>
     </w:p>
     <w:p>
@@ -1232,12 +1097,42 @@
           <w:szCs w:val="24"/>
           <w:rtl w:val="0"/>
         </w:rPr>
-        <w:t xml:space="preserve">Integrated Giphy for GIF insertion and built post duplication feature for content creators.</w:t>
-      </w:r>
-      <w:r>
-        <w:rPr>
-          <w:rtl w:val="0"/>
-        </w:rPr>
+        <w:t xml:space="preserve">Led React migration from WordPress monolith to Next.js, improving performance by 25%.</w:t>
+      </w:r>
+    </w:p>
+    <w:p>
+      <w:pPr>
+        <w:keepNext w:val="0"/>
+        <w:keepLines w:val="0"/>
+        <w:pageBreakBefore w:val="0"/>
+        <w:widowControl w:val="1"/>
+        <w:numPr>
+          <w:ilvl w:val="0"/>
+          <w:numId w:val="1"/>
+        </w:numPr>
+        <w:pBdr>
+          <w:top w:space="0" w:sz="0" w:val="nil"/>
+          <w:left w:space="0" w:sz="0" w:val="nil"/>
+          <w:bottom w:space="0" w:sz="0" w:val="nil"/>
+          <w:right w:space="0" w:sz="0" w:val="nil"/>
+          <w:between w:space="0" w:sz="0" w:val="nil"/>
+        </w:pBdr>
+        <w:shd w:fill="auto" w:val="clear"/>
+        <w:spacing w:after="0" w:before="0" w:line="276" w:lineRule="auto"/>
+        <w:ind w:left="-360" w:right="0" w:hanging="360"/>
+        <w:jc w:val="left"/>
+        <w:rPr>
+          <w:sz w:val="24"/>
+          <w:szCs w:val="24"/>
+        </w:rPr>
+      </w:pPr>
+      <w:r>
+        <w:rPr>
+          <w:sz w:val="24"/>
+          <w:szCs w:val="24"/>
+          <w:rtl w:val="0"/>
+        </w:rPr>
+        <w:t xml:space="preserve">Built reusable component library with optimized PHP REST APIs, replacing legacy AJAX handlers.</w:t>
       </w:r>
     </w:p>
     <w:p>
@@ -1254,8 +1149,8 @@
           <w:between w:space="0" w:sz="0" w:val="nil"/>
         </w:pBdr>
         <w:shd w:fill="auto" w:val="clear"/>
-        <w:spacing w:after="60" w:before="0" w:line="276" w:lineRule="auto"/>
-        <w:ind w:left="0" w:right="0" w:firstLine="0"/>
+        <w:spacing w:after="0" w:before="0" w:line="276" w:lineRule="auto"/>
+        <w:ind w:left="720" w:right="0" w:firstLine="0"/>
         <w:jc w:val="left"/>
         <w:rPr>
           <w:sz w:val="24"/>
@@ -1357,9 +1252,6 @@
           <w:type w:val="continuous"/>
           <w:pgSz w:h="15840" w:w="12240" w:orient="portrait"/>
           <w:pgMar w:bottom="720" w:top="720" w:left="1080" w:right="360" w:header="720" w:footer="720"/>
-          <w:cols w:equalWidth="0" w:num="1">
-            <w:col w:space="0" w:w="10800"/>
-          </w:cols>
         </w:sectPr>
       </w:pPr>
       <w:r>
@@ -1435,9 +1327,6 @@
           <w:type w:val="continuous"/>
           <w:pgSz w:h="15840" w:w="12240" w:orient="portrait"/>
           <w:pgMar w:bottom="720" w:top="720" w:left="1080" w:right="360" w:header="720" w:footer="720"/>
-          <w:cols w:equalWidth="0" w:num="1">
-            <w:col w:space="0" w:w="10800"/>
-          </w:cols>
         </w:sectPr>
       </w:pPr>
       <w:r>
@@ -1459,34 +1348,6 @@
         <w:rPr>
           <w:sz w:val="40"/>
           <w:szCs w:val="40"/>
-        </w:rPr>
-      </w:pPr>
-      <w:r>
-        <w:rPr>
-          <w:b w:val="1"/>
-          <w:bCs w:val="1"/>
-          <w:color w:val="000000"/>
-          <w:sz w:val="40"/>
-          <w:szCs w:val="40"/>
-          <w:rtl w:val="0"/>
-        </w:rPr>
-        <w:t xml:space="preserve">ADDITIONAL INFORMATION</w:t>
-      </w:r>
-      <w:r>
-        <w:rPr>
-          <w:rtl w:val="0"/>
-        </w:rPr>
-      </w:r>
-    </w:p>
-    <w:p>
-      <w:pPr>
-        <w:spacing w:after="60" w:lineRule="auto"/>
-        <w:ind w:left="-720" w:firstLine="0"/>
-        <w:rPr>
-          <w:b w:val="1"/>
-          <w:bCs w:val="1"/>
-          <w:sz w:val="24"/>
-          <w:szCs w:val="24"/>
         </w:rPr>
         <w:sectPr>
           <w:type w:val="continuous"/>
@@ -1500,29 +1361,30 @@
       </w:pPr>
       <w:r>
         <w:rPr>
-          <w:rtl w:val="0"/>
-        </w:rPr>
-      </w:r>
-    </w:p>
-    <w:p>
-      <w:pPr>
-        <w:spacing w:after="60" w:lineRule="auto"/>
-        <w:ind w:left="-720" w:firstLine="0"/>
-        <w:rPr>
-          <w:sz w:val="24"/>
-          <w:szCs w:val="24"/>
-        </w:rPr>
-      </w:pPr>
-      <w:r>
-        <w:rPr>
           <w:b w:val="1"/>
           <w:bCs w:val="1"/>
-          <w:sz w:val="24"/>
-          <w:szCs w:val="24"/>
-          <w:rtl w:val="0"/>
-        </w:rPr>
-        <w:t xml:space="preserve">Languages</w:t>
-      </w:r>
+          <w:color w:val="000000"/>
+          <w:sz w:val="40"/>
+          <w:szCs w:val="40"/>
+          <w:rtl w:val="0"/>
+        </w:rPr>
+        <w:t xml:space="preserve">ADDITIONAL INFORMATION</w:t>
+      </w:r>
+      <w:r>
+        <w:rPr>
+          <w:rtl w:val="0"/>
+        </w:rPr>
+      </w:r>
+    </w:p>
+    <w:p>
+      <w:pPr>
+        <w:spacing w:after="60" w:lineRule="auto"/>
+        <w:ind w:left="-720" w:firstLine="0"/>
+        <w:rPr>
+          <w:sz w:val="24"/>
+          <w:szCs w:val="24"/>
+        </w:rPr>
+      </w:pPr>
       <w:r>
         <w:rPr>
           <w:b w:val="1"/>
@@ -1531,7 +1393,7 @@
           <w:szCs w:val="24"/>
           <w:rtl w:val="0"/>
         </w:rPr>
-        <w:t xml:space="preserve">: </w:t>
+        <w:t xml:space="preserve">Languages: </w:t>
       </w:r>
       <w:r>
         <w:rPr>
@@ -1540,15 +1402,40 @@
           <w:rtl w:val="0"/>
         </w:rPr>
         <w:t xml:space="preserve">English (Fluent), Marathi (Fluent), Hindi (Native)</w:t>
+      </w:r>
+    </w:p>
+    <w:p>
+      <w:pPr>
+        <w:spacing w:after="60" w:lineRule="auto"/>
+        <w:ind w:left="-720" w:firstLine="0"/>
+        <w:rPr>
+          <w:sz w:val="24"/>
+          <w:szCs w:val="24"/>
+        </w:rPr>
+      </w:pPr>
+      <w:r>
+        <w:rPr>
+          <w:b w:val="1"/>
+          <w:bCs w:val="1"/>
+          <w:sz w:val="24"/>
+          <w:szCs w:val="24"/>
+          <w:rtl w:val="0"/>
+        </w:rPr>
+        <w:t xml:space="preserve">Soft Skills</w:t>
+      </w:r>
+      <w:r>
+        <w:rPr>
+          <w:sz w:val="24"/>
+          <w:szCs w:val="24"/>
+          <w:rtl w:val="0"/>
+        </w:rPr>
+        <w:t xml:space="preserve">: Problem-solving, cross-functional collaboration, technical documentation, ownership mentality </w:t>
       </w:r>
     </w:p>
     <w:sectPr>
       <w:type w:val="continuous"/>
       <w:pgSz w:h="15840" w:w="12240" w:orient="portrait"/>
       <w:pgMar w:bottom="720" w:top="720" w:left="1080" w:right="360" w:header="720" w:footer="720"/>
-      <w:cols w:equalWidth="0" w:num="1">
-        <w:col w:space="0" w:w="10800"/>
-      </w:cols>
     </w:sectPr>
   </w:body>
 </w:document>

</xml_diff>